<commit_message>
Migrar agentes de Anthropic a OpenAI
</commit_message>
<xml_diff>
--- a/docs/01_Guia_del_estudiante.docx
+++ b/docs/01_Guia_del_estudiante.docx
@@ -494,11 +494,7 @@
           </w:tcPr>
           <w:p>
             <w:r>
-              <w:rPr>
-                <w:sz w:val="19"/>
-                <w:szCs w:val="19"/>
-              </w:rPr>
-              <w:t xml:space="preserve">Python calcula indicadores; Claude los interpreta</w:t>
+              <w:t>Python calcula indicadores; OpenAI los interpreta</w:t>
             </w:r>
           </w:p>
         </w:tc>
@@ -2790,11 +2786,7 @@
           </w:tcPr>
           <w:p>
             <w:r>
-              <w:rPr>
-                <w:sz w:val="19"/>
-                <w:szCs w:val="19"/>
-              </w:rPr>
-              <w:t xml:space="preserve">ANTHROPIC_API_KEY</w:t>
+              <w:t>OPENAI_API_KEY</w:t>
             </w:r>
           </w:p>
         </w:tc>
@@ -2817,11 +2809,7 @@
           </w:tcPr>
           <w:p>
             <w:r>
-              <w:rPr>
-                <w:sz w:val="19"/>
-                <w:szCs w:val="19"/>
-              </w:rPr>
-              <w:t xml:space="preserve">Permite usar a Claude</w:t>
+              <w:t>Permite usar la API de OpenAI</w:t>
             </w:r>
           </w:p>
         </w:tc>
@@ -4778,47 +4766,7 @@
         <w:spacing w:after="80"/>
       </w:pPr>
       <w:r>
-        <w:t xml:space="preserve">Crea los cuatro secretos con los nombres exactos: </w:t>
-      </w:r>
-      <w:r>
-        <w:rPr>
-          <w:rFonts w:ascii="Consolas" w:cs="Consolas" w:eastAsia="Consolas" w:hAnsi="Consolas"/>
-          <w:color w:val="0E6F7A"/>
-        </w:rPr>
-        <w:t xml:space="preserve">TELEGRAM_BOT_TOKEN</w:t>
-      </w:r>
-      <w:r>
-        <w:t xml:space="preserve">, </w:t>
-      </w:r>
-      <w:r>
-        <w:rPr>
-          <w:rFonts w:ascii="Consolas" w:cs="Consolas" w:eastAsia="Consolas" w:hAnsi="Consolas"/>
-          <w:color w:val="0E6F7A"/>
-        </w:rPr>
-        <w:t xml:space="preserve">TELEGRAM_CHAT_ID</w:t>
-      </w:r>
-      <w:r>
-        <w:t xml:space="preserve">, </w:t>
-      </w:r>
-      <w:r>
-        <w:rPr>
-          <w:rFonts w:ascii="Consolas" w:cs="Consolas" w:eastAsia="Consolas" w:hAnsi="Consolas"/>
-          <w:color w:val="0E6F7A"/>
-        </w:rPr>
-        <w:t xml:space="preserve">ANTHROPIC_API_KEY</w:t>
-      </w:r>
-      <w:r>
-        <w:t xml:space="preserve">, </w:t>
-      </w:r>
-      <w:r>
-        <w:rPr>
-          <w:rFonts w:ascii="Consolas" w:cs="Consolas" w:eastAsia="Consolas" w:hAnsi="Consolas"/>
-          <w:color w:val="0E6F7A"/>
-        </w:rPr>
-        <w:t xml:space="preserve">ALPHAVANTAGE_API_KEY</w:t>
-      </w:r>
-      <w:r>
-        <w:t xml:space="preserve">.</w:t>
+        <w:t>Crea los cuatro secretos con los nombres exactos: TELEGRAM_BOT_TOKEN, TELEGRAM_CHAT_ID, OPENAI_API_KEY, ALPHAVANTAGE_API_KEY.</w:t>
       </w:r>
     </w:p>
     <w:p>
@@ -7603,13 +7551,7 @@
           </w:tcPr>
           <w:p>
             <w:r>
-              <w:rPr>
-                <w:rFonts w:ascii="Consolas" w:cs="Consolas" w:eastAsia="Consolas" w:hAnsi="Consolas"/>
-                <w:color w:val="0E6F7A"/>
-                <w:sz w:val="19"/>
-                <w:szCs w:val="19"/>
-              </w:rPr>
-              <w:t xml:space="preserve">Error de la API de Claude</w:t>
+              <w:t>Error de la API de OpenAI</w:t>
             </w:r>
           </w:p>
         </w:tc>
@@ -7861,16 +7803,8 @@
         <w:spacing w:after="60"/>
       </w:pPr>
       <w:r>
-        <w:t xml:space="preserve">Claude Platform Docs, MCP connector: </w:t>
-      </w:r>
-      <w:hyperlink w:history="1" r:id="rIdiiesmxdvuj57zsflxzji-">
-        <w:r>
-          <w:rPr>
-            <w:rStyle w:val="Hyperlink"/>
-          </w:rPr>
-          <w:t xml:space="preserve">https://platform.claude.com/docs/en/agents-and-tools/mcp-connector</w:t>
-        </w:r>
-      </w:hyperlink>
+        <w:t>OpenAI Docs, servidores MCP remotos: https://developers.openai.com/api/docs/guides/tools-connectors-mcp</w:t>
+      </w:r>
     </w:p>
     <w:p>
       <w:pPr>

</xml_diff>